<commit_message>
fixing the activies and lectures slowly - this is a working version of the folder and there is a back up
</commit_message>
<xml_diff>
--- a/docs/content/analysis_of_variance/analysis_of_variance_lecture.docx
+++ b/docs/content/analysis_of_variance/analysis_of_variance_lecture.docx
@@ -2445,6 +2445,9 @@
           </m:sup>
         </m:sSup>
       </m:oMath>
+      <w:r>
+        <w:t xml:space="preserve">​</w:t>
+      </w:r>
     </w:p>
     <w:p>
       <w:pPr>
@@ -3528,6 +3531,9 @@
                 </m:sub>
               </m:sSub>
             </m:oMath>
+            <w:r>
+              <w:t xml:space="preserve">​</w:t>
+            </w:r>
           </w:p>
           <w:p>
             <w:pPr>

</xml_diff>

<commit_message>
fixed finally almost there
</commit_message>
<xml_diff>
--- a/docs/content/analysis_of_variance/analysis_of_variance_lecture.docx
+++ b/docs/content/analysis_of_variance/analysis_of_variance_lecture.docx
@@ -260,14 +260,14 @@
     </w:tbl>
     <w:p>
       <w:pPr>
-        <w:pStyle w:val="BodyText"/>
+        <w:pStyle w:val="CaptionedFigure"/>
       </w:pPr>
       <w:r>
         <w:drawing>
           <wp:inline>
             <wp:extent cx="2857500" cy="1859769"/>
             <wp:effectExtent b="0" l="0" r="0" t="0"/>
-            <wp:docPr descr="" title="" id="13" name="Picture"/>
+            <wp:docPr descr="XKCD comic ‘Linear Regression’: a scatterplot of scattered points with a nearly flat fitted regression line labeled R-squared = 0.06 next to the same points connected into a constellation-like stick figure labeled ‘Rexthor, the Dog-Bearer’, captioned ‘I don’t trust linear regressions when it’s harder to guess the direction of the correlation from the scatter plot than to find new constellations on it.’" title="" id="13" name="Picture"/>
             <a:graphic>
               <a:graphicData uri="http://schemas.openxmlformats.org/drawingml/2006/picture">
                 <pic:pic>
@@ -303,6 +303,38 @@
             </a:graphic>
           </wp:inline>
         </w:drawing>
+      </w:r>
+    </w:p>
+    <w:p>
+      <w:pPr>
+        <w:pStyle w:val="ImageCaption"/>
+      </w:pPr>
+      <w:r>
+        <w:t xml:space="preserve">XKCD comic</w:t>
+      </w:r>
+      <w:r>
+        <w:t xml:space="preserve"> </w:t>
+      </w:r>
+      <w:r>
+        <w:t xml:space="preserve">‘Linear Regression’</w:t>
+      </w:r>
+      <w:r>
+        <w:t xml:space="preserve">: a scatterplot of scattered points with a nearly flat fitted regression line labeled R-squared = 0.06 next to the same points connected into a constellation-like stick figure labeled</w:t>
+      </w:r>
+      <w:r>
+        <w:t xml:space="preserve"> </w:t>
+      </w:r>
+      <w:r>
+        <w:t xml:space="preserve">‘Rexthor, the Dog-Bearer’</w:t>
+      </w:r>
+      <w:r>
+        <w:t xml:space="preserve">, captioned</w:t>
+      </w:r>
+      <w:r>
+        <w:t xml:space="preserve"> </w:t>
+      </w:r>
+      <w:r>
+        <w:t xml:space="preserve">‘I don’t trust linear regressions when it’s harder to guess the direction of the correlation from the scatter plot than to find new constellations on it.’</w:t>
       </w:r>
     </w:p>
     <w:bookmarkEnd w:id="15"/>
@@ -6657,14 +6689,14 @@
     </w:p>
     <w:p>
       <w:pPr>
-        <w:pStyle w:val="FirstParagraph"/>
+        <w:pStyle w:val="CaptionedFigure"/>
       </w:pPr>
       <w:r>
         <w:drawing>
           <wp:inline>
             <wp:extent cx="3657600" cy="3135085"/>
             <wp:effectExtent b="0" l="0" r="0" t="0"/>
-            <wp:docPr descr="" title="" id="84" name="Picture"/>
+            <wp:docPr descr="Multi-panel model diagnostic figure generated by performance::check_model(), including residual, normality, homogeneity of variance, and collinearity panels with built-in reference bands." title="" id="84" name="Picture"/>
             <a:graphic>
               <a:graphicData uri="http://schemas.openxmlformats.org/drawingml/2006/picture">
                 <pic:pic>
@@ -6700,6 +6732,14 @@
             </a:graphic>
           </wp:inline>
         </w:drawing>
+      </w:r>
+    </w:p>
+    <w:p>
+      <w:pPr>
+        <w:pStyle w:val="ImageCaption"/>
+      </w:pPr>
+      <w:r>
+        <w:t xml:space="preserve">Multi-panel model diagnostic figure generated by performance::check_model(), including residual, normality, homogeneity of variance, and collinearity panels with built-in reference bands.</w:t>
       </w:r>
     </w:p>
     <w:tbl>

</xml_diff>

<commit_message>
fixed a few of the pages t test and othes
</commit_message>
<xml_diff>
--- a/docs/content/analysis_of_variance/analysis_of_variance_lecture.docx
+++ b/docs/content/analysis_of_variance/analysis_of_variance_lecture.docx
@@ -265,7 +265,7 @@
       <w:r>
         <w:drawing>
           <wp:inline>
-            <wp:extent cx="2857500" cy="1859769"/>
+            <wp:extent cx="2852928" cy="1856793"/>
             <wp:effectExtent b="0" l="0" r="0" t="0"/>
             <wp:docPr descr="XKCD comic ‘Linear Regression’: a scatterplot of scattered points with a nearly flat fitted regression line labeled R-squared = 0.06 next to the same points connected into a constellation-like stick figure labeled ‘Rexthor, the Dog-Bearer’, captioned ‘I don’t trust linear regressions when it’s harder to guess the direction of the correlation from the scatter plot than to find new constellations on it.’" title="" id="13" name="Picture"/>
             <a:graphic>
@@ -286,7 +286,7 @@
                   <pic:spPr bwMode="auto">
                     <a:xfrm>
                       <a:off x="0" y="0"/>
-                      <a:ext cx="2857500" cy="1859769"/>
+                      <a:ext cx="2852928" cy="1856793"/>
                     </a:xfrm>
                     <a:prstGeom prst="rect">
                       <a:avLst/>

</xml_diff>